<commit_message>
Added Flutter Web WASM support
</commit_message>
<xml_diff>
--- a/flutter_documents/f1_widgets_and_UI/f14_part2_of_flutter_extras_of_basic.docx
+++ b/flutter_documents/f1_widgets_and_UI/f14_part2_of_flutter_extras_of_basic.docx
@@ -33,6 +33,22 @@
           <w:szCs w:val="32"/>
         </w:rPr>
       </w:pPr>
+      <w:r>
+        <w:rPr>
+          <w:b/>
+          <w:bCs/>
+          <w:sz w:val="32"/>
+          <w:szCs w:val="32"/>
+        </w:rPr>
+        <w:t>Flutter</w:t>
+      </w:r>
+      <w:r>
+        <w:rPr>
+          <w:sz w:val="32"/>
+          <w:szCs w:val="32"/>
+        </w:rPr>
+        <w:t xml:space="preserve"> Working Mechanics………………………………………………</w:t>
+      </w:r>
     </w:p>
     <w:p>
       <w:pPr>
@@ -49,26 +65,33 @@
       </w:pPr>
       <w:r>
         <w:rPr>
-          <w:b/>
-          <w:bCs/>
-          <w:sz w:val="32"/>
-          <w:szCs w:val="32"/>
-        </w:rPr>
-        <w:t>Flutter</w:t>
-      </w:r>
-      <w:r>
-        <w:rPr>
-          <w:sz w:val="32"/>
-          <w:szCs w:val="32"/>
-        </w:rPr>
-        <w:t xml:space="preserve"> Working Mechanics</w:t>
-      </w:r>
-      <w:r>
-        <w:rPr>
-          <w:sz w:val="32"/>
-          <w:szCs w:val="32"/>
-        </w:rPr>
-        <w:t>………………………………………………</w:t>
+          <w:sz w:val="32"/>
+          <w:szCs w:val="32"/>
+        </w:rPr>
+        <w:t xml:space="preserve">More on Running </w:t>
+      </w:r>
+      <w:r>
+        <w:rPr>
+          <w:b/>
+          <w:bCs/>
+          <w:sz w:val="32"/>
+          <w:szCs w:val="32"/>
+        </w:rPr>
+        <w:t xml:space="preserve">Flutter </w:t>
+      </w:r>
+      <w:r>
+        <w:rPr>
+          <w:sz w:val="32"/>
+          <w:szCs w:val="32"/>
+        </w:rPr>
+        <w:t>App in Android</w:t>
+      </w:r>
+      <w:r>
+        <w:rPr>
+          <w:sz w:val="32"/>
+          <w:szCs w:val="32"/>
+        </w:rPr>
+        <w:t>…………………………….</w:t>
       </w:r>
     </w:p>
     <w:p>
@@ -86,34 +109,45 @@
       </w:pPr>
       <w:r>
         <w:rPr>
-          <w:sz w:val="32"/>
-          <w:szCs w:val="32"/>
-        </w:rPr>
-        <w:t xml:space="preserve">More on Running </w:t>
-      </w:r>
-      <w:r>
-        <w:rPr>
-          <w:b/>
-          <w:bCs/>
-          <w:sz w:val="32"/>
-          <w:szCs w:val="32"/>
-        </w:rPr>
-        <w:t xml:space="preserve">Flutter </w:t>
-      </w:r>
-      <w:r>
-        <w:rPr>
-          <w:sz w:val="32"/>
-          <w:szCs w:val="32"/>
-        </w:rPr>
-        <w:t>App in Android</w:t>
-      </w:r>
-      <w:r>
-        <w:rPr>
-          <w:sz w:val="32"/>
-          <w:szCs w:val="32"/>
-        </w:rPr>
-        <w:t>…………………………….</w:t>
-      </w:r>
+          <w:b/>
+          <w:bCs/>
+          <w:sz w:val="32"/>
+          <w:szCs w:val="32"/>
+        </w:rPr>
+        <w:t>Flutter</w:t>
+      </w:r>
+      <w:r>
+        <w:rPr>
+          <w:sz w:val="32"/>
+          <w:szCs w:val="32"/>
+        </w:rPr>
+        <w:t xml:space="preserve"> vs </w:t>
+      </w:r>
+      <w:r>
+        <w:rPr>
+          <w:b/>
+          <w:bCs/>
+          <w:sz w:val="32"/>
+          <w:szCs w:val="32"/>
+        </w:rPr>
+        <w:t>Kotlin</w:t>
+      </w:r>
+      <w:r>
+        <w:rPr>
+          <w:sz w:val="32"/>
+          <w:szCs w:val="32"/>
+        </w:rPr>
+        <w:t>…………………………………………………………</w:t>
+      </w:r>
+      <w:proofErr w:type="gramStart"/>
+      <w:r>
+        <w:rPr>
+          <w:sz w:val="32"/>
+          <w:szCs w:val="32"/>
+        </w:rPr>
+        <w:t>…..</w:t>
+      </w:r>
+      <w:proofErr w:type="gramEnd"/>
     </w:p>
     <w:p>
       <w:pPr>
@@ -130,35 +164,26 @@
       </w:pPr>
       <w:r>
         <w:rPr>
-          <w:b/>
-          <w:bCs/>
-          <w:sz w:val="32"/>
-          <w:szCs w:val="32"/>
-        </w:rPr>
-        <w:t>Flutter</w:t>
-      </w:r>
-      <w:r>
-        <w:rPr>
-          <w:sz w:val="32"/>
-          <w:szCs w:val="32"/>
-        </w:rPr>
-        <w:t xml:space="preserve"> vs </w:t>
-      </w:r>
-      <w:r>
-        <w:rPr>
-          <w:b/>
-          <w:bCs/>
-          <w:sz w:val="32"/>
-          <w:szCs w:val="32"/>
-        </w:rPr>
-        <w:t>Kotlin</w:t>
-      </w:r>
-      <w:r>
-        <w:rPr>
-          <w:sz w:val="32"/>
-          <w:szCs w:val="32"/>
-        </w:rPr>
-        <w:t>…………………………………………………………</w:t>
+          <w:sz w:val="32"/>
+          <w:szCs w:val="32"/>
+        </w:rPr>
+        <w:t xml:space="preserve">Socket/WebSocket (With </w:t>
+      </w:r>
+      <w:r>
+        <w:rPr>
+          <w:b/>
+          <w:bCs/>
+          <w:sz w:val="32"/>
+          <w:szCs w:val="32"/>
+        </w:rPr>
+        <w:t>Firebase</w:t>
+      </w:r>
+      <w:r>
+        <w:rPr>
+          <w:sz w:val="32"/>
+          <w:szCs w:val="32"/>
+        </w:rPr>
+        <w:t xml:space="preserve"> Realtime </w:t>
       </w:r>
       <w:proofErr w:type="gramStart"/>
       <w:r>
@@ -166,9 +191,23 @@
           <w:sz w:val="32"/>
           <w:szCs w:val="32"/>
         </w:rPr>
-        <w:t>…..</w:t>
+        <w:t>DB)</w:t>
+      </w:r>
+      <w:r>
+        <w:rPr>
+          <w:sz w:val="32"/>
+          <w:szCs w:val="32"/>
+        </w:rPr>
+        <w:t>…</w:t>
       </w:r>
       <w:proofErr w:type="gramEnd"/>
+      <w:r>
+        <w:rPr>
+          <w:sz w:val="32"/>
+          <w:szCs w:val="32"/>
+        </w:rPr>
+        <w:t>………………</w:t>
+      </w:r>
     </w:p>
     <w:p>
       <w:pPr>
@@ -188,46 +227,23 @@
           <w:sz w:val="32"/>
           <w:szCs w:val="32"/>
         </w:rPr>
-        <w:t xml:space="preserve">Socket/WebSocket (With </w:t>
-      </w:r>
-      <w:r>
-        <w:rPr>
-          <w:b/>
-          <w:bCs/>
-          <w:sz w:val="32"/>
-          <w:szCs w:val="32"/>
-        </w:rPr>
-        <w:t>Firebase</w:t>
-      </w:r>
-      <w:r>
-        <w:rPr>
-          <w:sz w:val="32"/>
-          <w:szCs w:val="32"/>
-        </w:rPr>
-        <w:t xml:space="preserve"> Realtime </w:t>
-      </w:r>
-      <w:proofErr w:type="gramStart"/>
-      <w:r>
-        <w:rPr>
-          <w:sz w:val="32"/>
-          <w:szCs w:val="32"/>
-        </w:rPr>
-        <w:t>DB)</w:t>
-      </w:r>
-      <w:r>
-        <w:rPr>
-          <w:sz w:val="32"/>
-          <w:szCs w:val="32"/>
-        </w:rPr>
-        <w:t>…</w:t>
-      </w:r>
-      <w:proofErr w:type="gramEnd"/>
-      <w:r>
-        <w:rPr>
-          <w:sz w:val="32"/>
-          <w:szCs w:val="32"/>
-        </w:rPr>
-        <w:t>………………</w:t>
+        <w:t>Gradle, Cocoa Pods &amp; SPM in</w:t>
+      </w:r>
+      <w:r>
+        <w:rPr>
+          <w:b/>
+          <w:bCs/>
+          <w:sz w:val="32"/>
+          <w:szCs w:val="32"/>
+        </w:rPr>
+        <w:t xml:space="preserve"> Flutter</w:t>
+      </w:r>
+      <w:r>
+        <w:rPr>
+          <w:sz w:val="32"/>
+          <w:szCs w:val="32"/>
+        </w:rPr>
+        <w:t>…………………………………</w:t>
       </w:r>
     </w:p>
     <w:p>
@@ -243,28 +259,48 @@
           <w:szCs w:val="32"/>
         </w:rPr>
       </w:pPr>
-      <w:r>
-        <w:rPr>
-          <w:sz w:val="32"/>
-          <w:szCs w:val="32"/>
-        </w:rPr>
-        <w:t>Gradle, Cocoa Pods &amp; SPM in</w:t>
-      </w:r>
-      <w:r>
-        <w:rPr>
-          <w:b/>
-          <w:bCs/>
-          <w:sz w:val="32"/>
-          <w:szCs w:val="32"/>
-        </w:rPr>
-        <w:t xml:space="preserve"> Flutter</w:t>
-      </w:r>
-      <w:r>
-        <w:rPr>
-          <w:sz w:val="32"/>
-          <w:szCs w:val="32"/>
-        </w:rPr>
-        <w:t>…………………………………</w:t>
+      <w:proofErr w:type="spellStart"/>
+      <w:r>
+        <w:rPr>
+          <w:b/>
+          <w:bCs/>
+          <w:sz w:val="32"/>
+          <w:szCs w:val="32"/>
+        </w:rPr>
+        <w:t>MainActivity.kt</w:t>
+      </w:r>
+      <w:proofErr w:type="spellEnd"/>
+      <w:r>
+        <w:rPr>
+          <w:sz w:val="32"/>
+          <w:szCs w:val="32"/>
+        </w:rPr>
+        <w:t xml:space="preserve"> (Android) &amp; </w:t>
+      </w:r>
+      <w:proofErr w:type="spellStart"/>
+      <w:r>
+        <w:rPr>
+          <w:b/>
+          <w:bCs/>
+          <w:sz w:val="32"/>
+          <w:szCs w:val="32"/>
+        </w:rPr>
+        <w:t>AppDelegate.swift</w:t>
+      </w:r>
+      <w:proofErr w:type="spellEnd"/>
+      <w:r>
+        <w:rPr>
+          <w:sz w:val="32"/>
+          <w:szCs w:val="32"/>
+        </w:rPr>
+        <w:t xml:space="preserve"> (iOS)</w:t>
+      </w:r>
+      <w:r>
+        <w:rPr>
+          <w:sz w:val="32"/>
+          <w:szCs w:val="32"/>
+        </w:rPr>
+        <w:t>……………</w:t>
       </w:r>
     </w:p>
     <w:p>
@@ -280,63 +316,6 @@
           <w:szCs w:val="32"/>
         </w:rPr>
       </w:pPr>
-      <w:proofErr w:type="spellStart"/>
-      <w:r>
-        <w:rPr>
-          <w:b/>
-          <w:bCs/>
-          <w:sz w:val="32"/>
-          <w:szCs w:val="32"/>
-        </w:rPr>
-        <w:t>MainActivity.kt</w:t>
-      </w:r>
-      <w:proofErr w:type="spellEnd"/>
-      <w:r>
-        <w:rPr>
-          <w:sz w:val="32"/>
-          <w:szCs w:val="32"/>
-        </w:rPr>
-        <w:t xml:space="preserve"> (Android) &amp; </w:t>
-      </w:r>
-      <w:proofErr w:type="spellStart"/>
-      <w:r>
-        <w:rPr>
-          <w:b/>
-          <w:bCs/>
-          <w:sz w:val="32"/>
-          <w:szCs w:val="32"/>
-        </w:rPr>
-        <w:t>AppDelegate.swift</w:t>
-      </w:r>
-      <w:proofErr w:type="spellEnd"/>
-      <w:r>
-        <w:rPr>
-          <w:sz w:val="32"/>
-          <w:szCs w:val="32"/>
-        </w:rPr>
-        <w:t xml:space="preserve"> (iOS)</w:t>
-      </w:r>
-      <w:r>
-        <w:rPr>
-          <w:sz w:val="32"/>
-          <w:szCs w:val="32"/>
-        </w:rPr>
-        <w:t>……………</w:t>
-      </w:r>
-    </w:p>
-    <w:p>
-      <w:pPr>
-        <w:pStyle w:val="ListParagraph"/>
-        <w:numPr>
-          <w:ilvl w:val="0"/>
-          <w:numId w:val="47"/>
-        </w:numPr>
-        <w:jc w:val="both"/>
-        <w:rPr>
-          <w:sz w:val="32"/>
-          <w:szCs w:val="32"/>
-        </w:rPr>
-      </w:pPr>
       <w:r>
         <w:rPr>
           <w:b/>
@@ -708,7 +687,32 @@
           <w:sz w:val="32"/>
           <w:szCs w:val="32"/>
         </w:rPr>
-        <w:t xml:space="preserve"> (</w:t>
+        <w:t>/</w:t>
+      </w:r>
+      <w:proofErr w:type="spellStart"/>
+      <w:r>
+        <w:rPr>
+          <w:b/>
+          <w:bCs/>
+          <w:sz w:val="32"/>
+          <w:szCs w:val="32"/>
+        </w:rPr>
+        <w:t>WebAssembly</w:t>
+      </w:r>
+      <w:proofErr w:type="spellEnd"/>
+      <w:r>
+        <w:rPr>
+          <w:sz w:val="32"/>
+          <w:szCs w:val="32"/>
+        </w:rPr>
+        <w:t xml:space="preserve"> </w:t>
+      </w:r>
+      <w:r>
+        <w:rPr>
+          <w:sz w:val="32"/>
+          <w:szCs w:val="32"/>
+        </w:rPr>
+        <w:t>(</w:t>
       </w:r>
       <w:bookmarkStart w:id="0" w:name="_Hlk235894396"/>
       <w:r>
@@ -718,7 +722,41 @@
           <w:sz w:val="32"/>
           <w:szCs w:val="32"/>
         </w:rPr>
-        <w:t>Dart2JS</w:t>
+        <w:t>d</w:t>
+      </w:r>
+      <w:r>
+        <w:rPr>
+          <w:b/>
+          <w:bCs/>
+          <w:sz w:val="32"/>
+          <w:szCs w:val="32"/>
+        </w:rPr>
+        <w:t>art2</w:t>
+      </w:r>
+      <w:r>
+        <w:rPr>
+          <w:b/>
+          <w:bCs/>
+          <w:sz w:val="32"/>
+          <w:szCs w:val="32"/>
+        </w:rPr>
+        <w:t>js</w:t>
+      </w:r>
+      <w:r>
+        <w:rPr>
+          <w:sz w:val="32"/>
+          <w:szCs w:val="32"/>
+        </w:rPr>
+        <w:t>/</w:t>
+      </w:r>
+      <w:r>
+        <w:rPr>
+          <w:b/>
+          <w:bCs/>
+          <w:sz w:val="32"/>
+          <w:szCs w:val="32"/>
+        </w:rPr>
+        <w:t>dart2wasm</w:t>
       </w:r>
       <w:r>
         <w:rPr>
@@ -770,6 +808,22 @@
       </w:r>
       <w:r>
         <w:rPr>
+          <w:sz w:val="32"/>
+          <w:szCs w:val="32"/>
+        </w:rPr>
+        <w:t>/</w:t>
+      </w:r>
+      <w:r>
+        <w:rPr>
+          <w:b/>
+          <w:bCs/>
+          <w:sz w:val="32"/>
+          <w:szCs w:val="32"/>
+        </w:rPr>
+        <w:t>WASM</w:t>
+      </w:r>
+      <w:r>
+        <w:rPr>
           <w:b/>
           <w:bCs/>
           <w:sz w:val="32"/>
@@ -790,7 +844,28 @@
           <w:sz w:val="32"/>
           <w:szCs w:val="32"/>
         </w:rPr>
-        <w:t>) for web browsers</w:t>
+        <w:t>)</w:t>
+      </w:r>
+      <w:r>
+        <w:rPr>
+          <w:sz w:val="32"/>
+          <w:szCs w:val="32"/>
+        </w:rPr>
+        <w:t xml:space="preserve"> </w:t>
+      </w:r>
+      <w:r>
+        <w:rPr>
+          <w:sz w:val="32"/>
+          <w:szCs w:val="32"/>
+        </w:rPr>
+        <w:t>f</w:t>
+      </w:r>
+      <w:r>
+        <w:rPr>
+          <w:sz w:val="32"/>
+          <w:szCs w:val="32"/>
+        </w:rPr>
+        <w:t>or web browsers</w:t>
       </w:r>
     </w:p>
     <w:p>
@@ -3221,19 +3296,8 @@
                 <w:sz w:val="32"/>
                 <w:szCs w:val="32"/>
               </w:rPr>
-              <w:t xml:space="preserve">Can cause animation </w:t>
+              <w:t>Can cause animation jank</w:t>
             </w:r>
-            <w:proofErr w:type="spellStart"/>
-            <w:r>
-              <w:rPr>
-                <w:b w:val="0"/>
-                <w:bCs w:val="0"/>
-                <w:sz w:val="32"/>
-                <w:szCs w:val="32"/>
-              </w:rPr>
-              <w:t>jank</w:t>
-            </w:r>
-            <w:proofErr w:type="spellEnd"/>
           </w:p>
         </w:tc>
         <w:tc>
@@ -13500,7 +13564,6 @@
         </w:rPr>
         <w:t xml:space="preserve">, </w:t>
       </w:r>
-      <w:proofErr w:type="spellStart"/>
       <w:r>
         <w:rPr>
           <w:b/>
@@ -13510,7 +13573,6 @@
         </w:rPr>
         <w:t>Riverpod</w:t>
       </w:r>
-      <w:proofErr w:type="spellEnd"/>
       <w:r>
         <w:rPr>
           <w:sz w:val="32"/>

</xml_diff>